<commit_message>
Update Aqualogic Report template with team edits
Co-Authored-By: Claude Opus 4.7 <noreply@anthropic.com>
</commit_message>
<xml_diff>
--- a/public/assets/aqualogic/templates/Aqualogic_Report_Template.docx
+++ b/public/assets/aqualogic/templates/Aqualogic_Report_Template.docx
@@ -178,7 +178,7 @@
                 <w:sz w:val="62"/>
                 <w:szCs w:val="62"/>
               </w:rPr>
-              <w:t xml:space="preserve">Leakage Workstreams</w:t>
+              <w:t xml:space="preserve">[Report title]</w:t>
             </w:r>
           </w:p>
           <w:p>
@@ -196,7 +196,7 @@
                 <w:sz w:val="30"/>
                 <w:szCs w:val="30"/>
               </w:rPr>
-              <w:t xml:space="preserve">South West Water</w:t>
+              <w:t xml:space="preserve">[Client name]</w:t>
             </w:r>
           </w:p>
           <w:p>
@@ -214,7 +214,7 @@
                 <w:sz w:val="22"/>
                 <w:szCs w:val="22"/>
               </w:rPr>
-              <w:t xml:space="preserve">2026/27 reporting year    ·    Period 2 update</w:t>
+              <w:t xml:space="preserve">[Reporting period]</w:t>
             </w:r>
           </w:p>
         </w:tc>
@@ -341,7 +341,7 @@
                 <w:sz w:val="20"/>
                 <w:szCs w:val="20"/>
               </w:rPr>
-              <w:t xml:space="preserve">SWW_FS0_01_2026/27</w:t>
+              <w:t xml:space="preserve">[Report reference]</w:t>
             </w:r>
           </w:p>
         </w:tc>
@@ -411,7 +411,7 @@
                 <w:sz w:val="20"/>
                 <w:szCs w:val="20"/>
               </w:rPr>
-              <w:t xml:space="preserve">South West Water</w:t>
+              <w:t xml:space="preserve">[Client name]</w:t>
             </w:r>
           </w:p>
         </w:tc>
@@ -481,7 +481,7 @@
                 <w:sz w:val="20"/>
                 <w:szCs w:val="20"/>
               </w:rPr>
-              <w:t xml:space="preserve">Peninsula House, Rydon Lane, Exeter, Devon, EX2 7HR</w:t>
+              <w:t xml:space="preserve">[Client address]</w:t>
             </w:r>
           </w:p>
         </w:tc>
@@ -551,7 +551,7 @@
                 <w:sz w:val="20"/>
                 <w:szCs w:val="20"/>
               </w:rPr>
-              <w:t xml:space="preserve">Ray Haffron, rhaffron@southwestwater.co.uk</w:t>
+              <w:t xml:space="preserve">[Client contact, email]</w:t>
             </w:r>
           </w:p>
         </w:tc>
@@ -621,7 +621,7 @@
                 <w:sz w:val="20"/>
                 <w:szCs w:val="20"/>
               </w:rPr>
-              <w:t xml:space="preserve">Wayne Arscott, Water Services Director, WayneA@aqualogic-wc.com</w:t>
+              <w:t xml:space="preserve">[Name, role, email]</w:t>
             </w:r>
           </w:p>
         </w:tc>
@@ -691,7 +691,7 @@
                 <w:sz w:val="20"/>
                 <w:szCs w:val="20"/>
               </w:rPr>
-              <w:t xml:space="preserve">5 June 2026</w:t>
+              <w:t xml:space="preserve">[Date]</w:t>
             </w:r>
           </w:p>
         </w:tc>
@@ -761,7 +761,7 @@
                 <w:sz w:val="20"/>
                 <w:szCs w:val="20"/>
               </w:rPr>
-              <w:t xml:space="preserve">1.1</w:t>
+              <w:t xml:space="preserve">[Version]</w:t>
             </w:r>
           </w:p>
         </w:tc>
@@ -803,7 +803,7 @@
           <w:sz w:val="22"/>
           <w:szCs w:val="22"/>
         </w:rPr>
-        <w:t xml:space="preserve">This document provides a Period 2 update on the leakage-related workstreams at South West Water being delivered by Aqualogic as part of the field services framework contract with Pennon Group.</w:t>
+        <w:t xml:space="preserve">[Add a short outline of what this report covers and who it is for.]</w:t>
       </w:r>
     </w:p>
     <w:p>
@@ -887,7 +887,7 @@
           <w:sz w:val="22"/>
           <w:szCs w:val="22"/>
         </w:rPr>
-        <w:t xml:space="preserve">Aqualogic has been asked to continue supporting South West Water in delivering meaningful leakage reductions, helping to achieve both regulatory commitments and business performance targets.</w:t>
+        <w:t xml:space="preserve">Lorem ipsum dolor sit amet, consectetur adipiscing elit. Sed do eiusmod tempor incididunt ut labore et dolore magna aliqua. Ut enim ad minim veniam, quis nostrud exercitation ullamco laboris nisi ut aliquip ex ea commodo consequat.</w:t>
       </w:r>
     </w:p>
     <w:p>
@@ -906,7 +906,7 @@
           <w:sz w:val="22"/>
           <w:szCs w:val="22"/>
         </w:rPr>
-        <w:t xml:space="preserve">During the 2025/26 reporting year, Aqualogic delivered over 90 Ml/d of leakage savings through a suite of managed operational and strategic workstreams, making a significant contribution to South West Water's overall leakage performance.</w:t>
+        <w:t xml:space="preserve">Lorem ipsum dolor sit amet, consectetur adipiscing elit. Sed do eiusmod tempor incididunt ut labore et dolore magna aliqua. Ut enim ad minim veniam, quis nostrud exercitation ullamco laboris nisi ut aliquip ex ea commodo consequat.</w:t>
       </w:r>
     </w:p>
     <w:p>
@@ -925,7 +925,7 @@
           <w:sz w:val="22"/>
           <w:szCs w:val="22"/>
         </w:rPr>
-        <w:t xml:space="preserve">The table below summarises the achievements over the past 12 months and sets out what is forecast for 2026/27.</w:t>
+        <w:t xml:space="preserve">Lorem ipsum dolor sit amet, consectetur adipiscing elit. Sed do eiusmod tempor incididunt ut labore et dolore magna aliqua.</w:t>
       </w:r>
     </w:p>
     <w:tbl>
@@ -1259,7 +1259,7 @@
                 <w:sz w:val="18"/>
                 <w:szCs w:val="18"/>
               </w:rPr>
-              <w:t xml:space="preserve">Upstream Losses</w:t>
+              <w:t xml:space="preserve">Workstream B</w:t>
             </w:r>
           </w:p>
         </w:tc>
@@ -1290,7 +1290,7 @@
                 <w:sz w:val="18"/>
                 <w:szCs w:val="18"/>
               </w:rPr>
-              <w:t xml:space="preserve">1,265</w:t>
+              <w:t xml:space="preserve">0,000</w:t>
             </w:r>
           </w:p>
         </w:tc>
@@ -1321,7 +1321,7 @@
                 <w:sz w:val="18"/>
                 <w:szCs w:val="18"/>
               </w:rPr>
-              <w:t xml:space="preserve">17.7</w:t>
+              <w:t xml:space="preserve">00.0</w:t>
             </w:r>
           </w:p>
         </w:tc>
@@ -1352,7 +1352,7 @@
                 <w:sz w:val="18"/>
                 <w:szCs w:val="18"/>
               </w:rPr>
-              <w:t xml:space="preserve">1,860</w:t>
+              <w:t xml:space="preserve">0,000</w:t>
             </w:r>
           </w:p>
         </w:tc>
@@ -1383,7 +1383,7 @@
                 <w:sz w:val="18"/>
                 <w:szCs w:val="18"/>
               </w:rPr>
-              <w:t xml:space="preserve">24</w:t>
+              <w:t xml:space="preserve">00</w:t>
             </w:r>
           </w:p>
         </w:tc>
@@ -1414,7 +1414,7 @@
                 <w:sz w:val="18"/>
                 <w:szCs w:val="18"/>
               </w:rPr>
-              <w:t xml:space="preserve">£109,675.43</w:t>
+              <w:t xml:space="preserve">£00,000</w:t>
             </w:r>
           </w:p>
         </w:tc>
@@ -1448,7 +1448,7 @@
                 <w:sz w:val="18"/>
                 <w:szCs w:val="18"/>
               </w:rPr>
-              <w:t xml:space="preserve">DMA Optimisation</w:t>
+              <w:t xml:space="preserve">Workstream C</w:t>
             </w:r>
           </w:p>
         </w:tc>
@@ -1480,7 +1480,7 @@
                 <w:sz w:val="18"/>
                 <w:szCs w:val="18"/>
               </w:rPr>
-              <w:t xml:space="preserve">331 (28 wks)</w:t>
+              <w:t xml:space="preserve">000 (00 wks)</w:t>
             </w:r>
           </w:p>
         </w:tc>
@@ -1512,7 +1512,7 @@
                 <w:sz w:val="18"/>
                 <w:szCs w:val="18"/>
               </w:rPr>
-              <w:t xml:space="preserve">7.5</w:t>
+              <w:t xml:space="preserve">00.0</w:t>
             </w:r>
           </w:p>
         </w:tc>
@@ -1544,7 +1544,7 @@
                 <w:sz w:val="18"/>
                 <w:szCs w:val="18"/>
               </w:rPr>
-              <w:t xml:space="preserve">528</w:t>
+              <w:t xml:space="preserve">00</w:t>
             </w:r>
           </w:p>
         </w:tc>
@@ -1576,7 +1576,7 @@
                 <w:sz w:val="18"/>
                 <w:szCs w:val="18"/>
               </w:rPr>
-              <w:t xml:space="preserve">11.28</w:t>
+              <w:t xml:space="preserve">00.0</w:t>
             </w:r>
           </w:p>
         </w:tc>
@@ -1608,7 +1608,7 @@
                 <w:sz w:val="18"/>
                 <w:szCs w:val="18"/>
               </w:rPr>
-              <w:t xml:space="preserve">£99,995.83</w:t>
+              <w:t xml:space="preserve">£00,000</w:t>
             </w:r>
           </w:p>
         </w:tc>
@@ -1641,7 +1641,7 @@
                 <w:sz w:val="18"/>
                 <w:szCs w:val="18"/>
               </w:rPr>
-              <w:t xml:space="preserve">iQuarius+</w:t>
+              <w:t xml:space="preserve">Workstream D</w:t>
             </w:r>
           </w:p>
         </w:tc>
@@ -1672,7 +1672,7 @@
                 <w:sz w:val="18"/>
                 <w:szCs w:val="18"/>
               </w:rPr>
-              <w:t xml:space="preserve">4,472</w:t>
+              <w:t xml:space="preserve">0,000</w:t>
             </w:r>
           </w:p>
         </w:tc>
@@ -1703,7 +1703,7 @@
                 <w:sz w:val="18"/>
                 <w:szCs w:val="18"/>
               </w:rPr>
-              <w:t xml:space="preserve">52.3</w:t>
+              <w:t xml:space="preserve">00.0</w:t>
             </w:r>
           </w:p>
         </w:tc>
@@ -1734,7 +1734,7 @@
                 <w:sz w:val="18"/>
                 <w:szCs w:val="18"/>
               </w:rPr>
-              <w:t xml:space="preserve">4,512</w:t>
+              <w:t xml:space="preserve">0,000</w:t>
             </w:r>
           </w:p>
         </w:tc>
@@ -1765,7 +1765,7 @@
                 <w:sz w:val="18"/>
                 <w:szCs w:val="18"/>
               </w:rPr>
-              <w:t xml:space="preserve">48</w:t>
+              <w:t xml:space="preserve">00</w:t>
             </w:r>
           </w:p>
         </w:tc>
@@ -1796,7 +1796,7 @@
                 <w:sz w:val="18"/>
                 <w:szCs w:val="18"/>
               </w:rPr>
-              <w:t xml:space="preserve">£88,316.32</w:t>
+              <w:t xml:space="preserve">£00,000</w:t>
             </w:r>
           </w:p>
         </w:tc>
@@ -1830,7 +1830,7 @@
                 <w:sz w:val="18"/>
                 <w:szCs w:val="18"/>
               </w:rPr>
-              <w:t xml:space="preserve">Inoperable DMAs</w:t>
+              <w:t xml:space="preserve">Workstream E</w:t>
             </w:r>
           </w:p>
         </w:tc>
@@ -1862,7 +1862,7 @@
                 <w:sz w:val="18"/>
                 <w:szCs w:val="18"/>
               </w:rPr>
-              <w:t xml:space="preserve">174 (23 wks)</w:t>
+              <w:t xml:space="preserve">000 (00 wks)</w:t>
             </w:r>
           </w:p>
         </w:tc>
@@ -1894,7 +1894,7 @@
                 <w:sz w:val="18"/>
                 <w:szCs w:val="18"/>
               </w:rPr>
-              <w:t xml:space="preserve">2.4</w:t>
+              <w:t xml:space="preserve">00.0</w:t>
             </w:r>
           </w:p>
         </w:tc>
@@ -1926,7 +1926,7 @@
                 <w:sz w:val="18"/>
                 <w:szCs w:val="18"/>
               </w:rPr>
-              <w:t xml:space="preserve">420</w:t>
+              <w:t xml:space="preserve">00</w:t>
             </w:r>
           </w:p>
         </w:tc>
@@ -1958,7 +1958,7 @@
                 <w:sz w:val="18"/>
                 <w:szCs w:val="18"/>
               </w:rPr>
-              <w:t xml:space="preserve">4.56</w:t>
+              <w:t xml:space="preserve">00.0</w:t>
             </w:r>
           </w:p>
         </w:tc>
@@ -1990,7 +1990,7 @@
                 <w:sz w:val="18"/>
                 <w:szCs w:val="18"/>
               </w:rPr>
-              <w:t xml:space="preserve">£99,995.83</w:t>
+              <w:t xml:space="preserve">£00,000</w:t>
             </w:r>
           </w:p>
         </w:tc>
@@ -2023,7 +2023,7 @@
                 <w:sz w:val="18"/>
                 <w:szCs w:val="18"/>
               </w:rPr>
-              <w:t xml:space="preserve">Pressure Management</w:t>
+              <w:t xml:space="preserve">Workstream A</w:t>
             </w:r>
           </w:p>
         </w:tc>
@@ -2085,7 +2085,7 @@
                 <w:sz w:val="18"/>
                 <w:szCs w:val="18"/>
               </w:rPr>
-              <w:t xml:space="preserve">12.4</w:t>
+              <w:t xml:space="preserve">00.0</w:t>
             </w:r>
           </w:p>
         </w:tc>
@@ -2147,7 +2147,7 @@
                 <w:sz w:val="18"/>
                 <w:szCs w:val="18"/>
               </w:rPr>
-              <w:t xml:space="preserve">12.10</w:t>
+              <w:t xml:space="preserve">00.0</w:t>
             </w:r>
           </w:p>
         </w:tc>
@@ -2178,7 +2178,7 @@
                 <w:sz w:val="18"/>
                 <w:szCs w:val="18"/>
               </w:rPr>
-              <w:t xml:space="preserve">£98,103.35</w:t>
+              <w:t xml:space="preserve">£00,000</w:t>
             </w:r>
           </w:p>
         </w:tc>
@@ -2244,7 +2244,7 @@
                 <w:sz w:val="18"/>
                 <w:szCs w:val="18"/>
               </w:rPr>
-              <w:t xml:space="preserve">6,242</w:t>
+              <w:t xml:space="preserve">0,000</w:t>
             </w:r>
           </w:p>
         </w:tc>
@@ -2276,7 +2276,7 @@
                 <w:sz w:val="18"/>
                 <w:szCs w:val="18"/>
               </w:rPr>
-              <w:t xml:space="preserve">92.3</w:t>
+              <w:t xml:space="preserve">00.0</w:t>
             </w:r>
           </w:p>
         </w:tc>
@@ -2308,7 +2308,7 @@
                 <w:sz w:val="18"/>
                 <w:szCs w:val="18"/>
               </w:rPr>
-              <w:t xml:space="preserve">7,320</w:t>
+              <w:t xml:space="preserve">0,000</w:t>
             </w:r>
           </w:p>
         </w:tc>
@@ -2340,7 +2340,7 @@
                 <w:sz w:val="18"/>
                 <w:szCs w:val="18"/>
               </w:rPr>
-              <w:t xml:space="preserve">99.9</w:t>
+              <w:t xml:space="preserve">00.0</w:t>
             </w:r>
           </w:p>
         </w:tc>
@@ -2372,7 +2372,7 @@
                 <w:sz w:val="18"/>
                 <w:szCs w:val="18"/>
               </w:rPr>
-              <w:t xml:space="preserve">£99,217.35</w:t>
+              <w:t xml:space="preserve">£00,000</w:t>
             </w:r>
           </w:p>
         </w:tc>
@@ -2394,7 +2394,7 @@
           <w:sz w:val="22"/>
           <w:szCs w:val="22"/>
         </w:rPr>
-        <w:t xml:space="preserve">This document sets out the proposed continuation of these workstreams for the full 2026/27 reporting year, including:</w:t>
+        <w:t xml:space="preserve">Lorem ipsum dolor sit amet, consectetur adipiscing elit, including:</w:t>
       </w:r>
     </w:p>
     <w:p>
@@ -2417,7 +2417,7 @@
           <w:sz w:val="22"/>
           <w:szCs w:val="22"/>
         </w:rPr>
-        <w:t xml:space="preserve">the base budgets required to sustain delivery</w:t>
+        <w:t xml:space="preserve">lorem ipsum dolor sit amet</w:t>
       </w:r>
     </w:p>
     <w:p>
@@ -2440,7 +2440,7 @@
           <w:sz w:val="22"/>
           <w:szCs w:val="22"/>
         </w:rPr>
-        <w:t xml:space="preserve">the expected leakage savings volumes attributable to each workstream</w:t>
+        <w:t xml:space="preserve">consectetur adipiscing elit, sed do eiusmod tempor</w:t>
       </w:r>
     </w:p>
     <w:p>
@@ -2463,7 +2463,7 @@
           <w:sz w:val="22"/>
           <w:szCs w:val="22"/>
         </w:rPr>
-        <w:t xml:space="preserve">options for enhancement, optimisation or scaling to further support South West Water's strategic objectives.</w:t>
+        <w:t xml:space="preserve">incididunt ut labore et dolore magna aliqua.</w:t>
       </w:r>
     </w:p>
     <w:p>
@@ -2482,7 +2482,7 @@
           <w:sz w:val="22"/>
           <w:szCs w:val="22"/>
         </w:rPr>
-        <w:t xml:space="preserve">The sections that follow outline each workstream, the operational model Aqualogic will deploy, the resourcing and capability profile required, and the forecast impact on leakage performance across the year.</w:t>
+        <w:t xml:space="preserve">Lorem ipsum dolor sit amet, consectetur adipiscing elit. Sed do eiusmod tempor incididunt ut labore et dolore magna aliqua. Ut enim ad minim veniam, quis nostrud exercitation ullamco laboris nisi ut aliquip ex ea commodo consequat.</w:t>
       </w:r>
     </w:p>
     <w:p>
@@ -2518,7 +2518,7 @@
           <w:sz w:val="30"/>
           <w:szCs w:val="30"/>
         </w:rPr>
-        <w:t xml:space="preserve">Period 2 Performance Update</w:t>
+        <w:t xml:space="preserve">Performance Update</w:t>
       </w:r>
     </w:p>
     <w:p>
@@ -2537,7 +2537,7 @@
           <w:sz w:val="20"/>
           <w:szCs w:val="20"/>
         </w:rPr>
-        <w:t xml:space="preserve">April and May 2026</w:t>
+        <w:t xml:space="preserve">[Reporting period]</w:t>
       </w:r>
     </w:p>
     <w:tbl>
@@ -2587,7 +2587,7 @@
                 <w:sz w:val="40"/>
                 <w:szCs w:val="40"/>
               </w:rPr>
-              <w:t xml:space="preserve">90+ Ml/d</w:t>
+              <w:t xml:space="preserve">00 Ml/d</w:t>
             </w:r>
           </w:p>
           <w:p>
@@ -2606,7 +2606,7 @@
                 <w:sz w:val="17"/>
                 <w:szCs w:val="17"/>
               </w:rPr>
-              <w:t xml:space="preserve">delivered in 2025/26</w:t>
+              <w:t xml:space="preserve">[stat caption]</w:t>
             </w:r>
           </w:p>
         </w:tc>
@@ -2638,7 +2638,7 @@
                 <w:sz w:val="40"/>
                 <w:szCs w:val="40"/>
               </w:rPr>
-              <w:t xml:space="preserve">99.9 Ml/d</w:t>
+              <w:t xml:space="preserve">00 Ml/d</w:t>
             </w:r>
           </w:p>
           <w:p>
@@ -2657,7 +2657,7 @@
                 <w:sz w:val="17"/>
                 <w:szCs w:val="17"/>
               </w:rPr>
-              <w:t xml:space="preserve">forecast offset for 2026/27</w:t>
+              <w:t xml:space="preserve">[stat caption]</w:t>
             </w:r>
           </w:p>
         </w:tc>
@@ -2689,7 +2689,7 @@
                 <w:sz w:val="40"/>
                 <w:szCs w:val="40"/>
               </w:rPr>
-              <w:t xml:space="preserve">+41.7%</w:t>
+              <w:t xml:space="preserve">00%</w:t>
             </w:r>
           </w:p>
           <w:p>
@@ -2708,7 +2708,7 @@
                 <w:sz w:val="17"/>
                 <w:szCs w:val="17"/>
               </w:rPr>
-              <w:t xml:space="preserve">ahead of plan in Period 2</w:t>
+              <w:t xml:space="preserve">[stat caption]</w:t>
             </w:r>
           </w:p>
         </w:tc>
@@ -2749,7 +2749,7 @@
           <w:sz w:val="22"/>
           <w:szCs w:val="22"/>
         </w:rPr>
-        <w:t xml:space="preserve">The forecast for 2026/27 indicates a total leakage volume offset of 99.9 Ml/d across all workstreams. The largest contribution is expected from iQuarius+ (48 Ml/d), followed by Upstream Losses (24 Ml/d), Pressure Management (12.10 Ml/d) and DMA Optimisation (11.28 Ml/d).</w:t>
+        <w:t xml:space="preserve">Lorem ipsum dolor sit amet, consectetur adipiscing elit. Sed do eiusmod tempor incididunt ut labore et dolore magna aliqua. Ut enim ad minim veniam, quis nostrud exercitation ullamco laboris nisi ut aliquip ex ea commodo consequat.</w:t>
       </w:r>
     </w:p>
     <w:p>
@@ -2768,7 +2768,7 @@
           <w:sz w:val="22"/>
           <w:szCs w:val="22"/>
         </w:rPr>
-        <w:t xml:space="preserve">In activity terms, iQuarius+ is forecast to deliver the highest number of detected leaks (4,512), accounting for the majority of total leak detections, and is expected to be the principal driver of leakage reduction over the year.</w:t>
+        <w:t xml:space="preserve">Lorem ipsum dolor sit amet, consectetur adipiscing elit. Sed do eiusmod tempor incididunt ut labore et dolore magna aliqua. Ut enim ad minim veniam, quis nostrud exercitation ullamco laboris nisi ut aliquip ex ea commodo consequat.</w:t>
       </w:r>
     </w:p>
     <w:p>
@@ -2787,7 +2787,7 @@
           <w:sz w:val="22"/>
           <w:szCs w:val="22"/>
         </w:rPr>
-        <w:t xml:space="preserve">For Period 2, performance is running ahead of forecast across all reported workstreams. Excluding Pressure Management, total detected leaks reached 1,681 against a forecast of 1,220, an uplift of 461 leaks (+37.8%). In leakage volume terms, total Period 2 delivery reached 23.61 Ml/d against 16.66 Ml/d forecast, exceeding plan by 6.95 Ml/d (+41.7%).</w:t>
+        <w:t xml:space="preserve">Lorem ipsum dolor sit amet, consectetur adipiscing elit. Sed do eiusmod tempor incididunt ut labore et dolore magna aliqua. Ut enim ad minim veniam, quis nostrud exercitation ullamco laboris nisi ut aliquip ex ea commodo consequat. Duis aute irure dolor in reprehenderit in voluptate velit esse cillum dolore eu fugiat nulla pariatur.</w:t>
       </w:r>
     </w:p>
     <w:p>
@@ -2806,7 +2806,7 @@
           <w:sz w:val="22"/>
           <w:szCs w:val="22"/>
         </w:rPr>
-        <w:t xml:space="preserve">The most significant overperformance came from iQuarius+, which delivered 1,078 leaks and 11.22 Ml/d against a forecast of 752 leaks and 8 Ml/d. DMA Optimisation also materially outperformed, delivering 4.56 Ml/d against 1.88 Ml/d, while Inoperable DMAs nearly doubled expected volume, achieving 1.50 Ml/d against 0.76 Ml/d. Upstream Losses performed broadly in line with plan, slightly ahead on both leak numbers and volume offset, and Pressure Management delivered above forecast at 2.23 Ml/d against 2.02 Ml/d.</w:t>
+        <w:t xml:space="preserve">Lorem ipsum dolor sit amet, consectetur adipiscing elit. Sed do eiusmod tempor incididunt ut labore et dolore magna aliqua. Ut enim ad minim veniam, quis nostrud exercitation ullamco laboris nisi ut aliquip ex ea commodo consequat. Duis aute irure dolor in reprehenderit in voluptate velit esse cillum dolore eu fugiat nulla pariatur.</w:t>
       </w:r>
     </w:p>
     <w:p>
@@ -2825,7 +2825,7 @@
           <w:sz w:val="22"/>
           <w:szCs w:val="22"/>
         </w:rPr>
-        <w:t xml:space="preserve">Overall, the data shows a strong start to the year, with delivery ahead of forecast in both activity and leakage impact. The current trend suggests strong momentum across the portfolio, particularly in iQuarius+ and DMA optimisation-led interventions. If sustained, this performance would place the wider programme in a strong position to meet or exceed its annual leakage reduction objectives.</w:t>
+        <w:t xml:space="preserve">Lorem ipsum dolor sit amet, consectetur adipiscing elit. Sed do eiusmod tempor incididunt ut labore et dolore magna aliqua. Ut enim ad minim veniam, quis nostrud exercitation ullamco laboris nisi ut aliquip ex ea commodo consequat. Duis aute irure dolor in reprehenderit in voluptate velit esse cillum dolore eu fugiat nulla pariatur.</w:t>
       </w:r>
     </w:p>
     <w:tbl>
@@ -2949,7 +2949,7 @@
                 <w:sz w:val="16"/>
                 <w:szCs w:val="16"/>
               </w:rPr>
-              <w:t xml:space="preserve">Period 2 forecast</w:t>
+              <w:t xml:space="preserve">Period forecast</w:t>
             </w:r>
           </w:p>
         </w:tc>
@@ -2982,7 +2982,7 @@
                 <w:sz w:val="16"/>
                 <w:szCs w:val="16"/>
               </w:rPr>
-              <w:t xml:space="preserve">Period 2 actual</w:t>
+              <w:t xml:space="preserve">Period actual</w:t>
             </w:r>
           </w:p>
         </w:tc>
@@ -3218,7 +3218,7 @@
                 <w:sz w:val="18"/>
                 <w:szCs w:val="18"/>
               </w:rPr>
-              <w:t xml:space="preserve">Upstream Losses</w:t>
+              <w:t xml:space="preserve">Workstream B</w:t>
             </w:r>
           </w:p>
         </w:tc>
@@ -3249,7 +3249,7 @@
                 <w:sz w:val="18"/>
                 <w:szCs w:val="18"/>
               </w:rPr>
-              <w:t xml:space="preserve">1,860</w:t>
+              <w:t xml:space="preserve">0,000</w:t>
             </w:r>
           </w:p>
         </w:tc>
@@ -3280,7 +3280,7 @@
                 <w:sz w:val="18"/>
                 <w:szCs w:val="18"/>
               </w:rPr>
-              <w:t xml:space="preserve">24</w:t>
+              <w:t xml:space="preserve">00</w:t>
             </w:r>
           </w:p>
         </w:tc>
@@ -3311,7 +3311,7 @@
                 <w:sz w:val="18"/>
                 <w:szCs w:val="18"/>
               </w:rPr>
-              <w:t xml:space="preserve">310</w:t>
+              <w:t xml:space="preserve">00</w:t>
             </w:r>
           </w:p>
         </w:tc>
@@ -3342,7 +3342,7 @@
                 <w:sz w:val="18"/>
                 <w:szCs w:val="18"/>
               </w:rPr>
-              <w:t xml:space="preserve">4</w:t>
+              <w:t xml:space="preserve">00</w:t>
             </w:r>
           </w:p>
         </w:tc>
@@ -3373,7 +3373,7 @@
                 <w:sz w:val="18"/>
                 <w:szCs w:val="18"/>
               </w:rPr>
-              <w:t xml:space="preserve">327</w:t>
+              <w:t xml:space="preserve">00</w:t>
             </w:r>
           </w:p>
         </w:tc>
@@ -3404,7 +3404,7 @@
                 <w:sz w:val="18"/>
                 <w:szCs w:val="18"/>
               </w:rPr>
-              <w:t xml:space="preserve">4.1</w:t>
+              <w:t xml:space="preserve">00.0</w:t>
             </w:r>
           </w:p>
         </w:tc>
@@ -3438,7 +3438,7 @@
                 <w:sz w:val="18"/>
                 <w:szCs w:val="18"/>
               </w:rPr>
-              <w:t xml:space="preserve">DMA Optimisation</w:t>
+              <w:t xml:space="preserve">Workstream C</w:t>
             </w:r>
           </w:p>
         </w:tc>
@@ -3470,7 +3470,7 @@
                 <w:sz w:val="18"/>
                 <w:szCs w:val="18"/>
               </w:rPr>
-              <w:t xml:space="preserve">528</w:t>
+              <w:t xml:space="preserve">00</w:t>
             </w:r>
           </w:p>
         </w:tc>
@@ -3502,7 +3502,7 @@
                 <w:sz w:val="18"/>
                 <w:szCs w:val="18"/>
               </w:rPr>
-              <w:t xml:space="preserve">11.28</w:t>
+              <w:t xml:space="preserve">00.0</w:t>
             </w:r>
           </w:p>
         </w:tc>
@@ -3534,7 +3534,7 @@
                 <w:sz w:val="18"/>
                 <w:szCs w:val="18"/>
               </w:rPr>
-              <w:t xml:space="preserve">88</w:t>
+              <w:t xml:space="preserve">00</w:t>
             </w:r>
           </w:p>
         </w:tc>
@@ -3566,7 +3566,7 @@
                 <w:sz w:val="18"/>
                 <w:szCs w:val="18"/>
               </w:rPr>
-              <w:t xml:space="preserve">1.88</w:t>
+              <w:t xml:space="preserve">00.0</w:t>
             </w:r>
           </w:p>
         </w:tc>
@@ -3598,7 +3598,7 @@
                 <w:sz w:val="18"/>
                 <w:szCs w:val="18"/>
               </w:rPr>
-              <w:t xml:space="preserve">147</w:t>
+              <w:t xml:space="preserve">00</w:t>
             </w:r>
           </w:p>
         </w:tc>
@@ -3630,7 +3630,7 @@
                 <w:sz w:val="18"/>
                 <w:szCs w:val="18"/>
               </w:rPr>
-              <w:t xml:space="preserve">4.56</w:t>
+              <w:t xml:space="preserve">00.0</w:t>
             </w:r>
           </w:p>
         </w:tc>
@@ -3663,7 +3663,7 @@
                 <w:sz w:val="18"/>
                 <w:szCs w:val="18"/>
               </w:rPr>
-              <w:t xml:space="preserve">iQuarius+</w:t>
+              <w:t xml:space="preserve">Workstream D</w:t>
             </w:r>
           </w:p>
         </w:tc>
@@ -3694,7 +3694,7 @@
                 <w:sz w:val="18"/>
                 <w:szCs w:val="18"/>
               </w:rPr>
-              <w:t xml:space="preserve">4,512</w:t>
+              <w:t xml:space="preserve">0,000</w:t>
             </w:r>
           </w:p>
         </w:tc>
@@ -3725,7 +3725,7 @@
                 <w:sz w:val="18"/>
                 <w:szCs w:val="18"/>
               </w:rPr>
-              <w:t xml:space="preserve">48</w:t>
+              <w:t xml:space="preserve">00</w:t>
             </w:r>
           </w:p>
         </w:tc>
@@ -3756,7 +3756,7 @@
                 <w:sz w:val="18"/>
                 <w:szCs w:val="18"/>
               </w:rPr>
-              <w:t xml:space="preserve">752</w:t>
+              <w:t xml:space="preserve">00</w:t>
             </w:r>
           </w:p>
         </w:tc>
@@ -3787,7 +3787,7 @@
                 <w:sz w:val="18"/>
                 <w:szCs w:val="18"/>
               </w:rPr>
-              <w:t xml:space="preserve">8</w:t>
+              <w:t xml:space="preserve">00</w:t>
             </w:r>
           </w:p>
         </w:tc>
@@ -3818,7 +3818,7 @@
                 <w:sz w:val="18"/>
                 <w:szCs w:val="18"/>
               </w:rPr>
-              <w:t xml:space="preserve">1,078</w:t>
+              <w:t xml:space="preserve">0,000</w:t>
             </w:r>
           </w:p>
         </w:tc>
@@ -3849,7 +3849,7 @@
                 <w:sz w:val="18"/>
                 <w:szCs w:val="18"/>
               </w:rPr>
-              <w:t xml:space="preserve">11.22</w:t>
+              <w:t xml:space="preserve">00.0</w:t>
             </w:r>
           </w:p>
         </w:tc>
@@ -3883,7 +3883,7 @@
                 <w:sz w:val="18"/>
                 <w:szCs w:val="18"/>
               </w:rPr>
-              <w:t xml:space="preserve">Inoperable DMAs</w:t>
+              <w:t xml:space="preserve">Workstream E</w:t>
             </w:r>
           </w:p>
         </w:tc>
@@ -3915,7 +3915,7 @@
                 <w:sz w:val="18"/>
                 <w:szCs w:val="18"/>
               </w:rPr>
-              <w:t xml:space="preserve">420</w:t>
+              <w:t xml:space="preserve">00</w:t>
             </w:r>
           </w:p>
         </w:tc>
@@ -3947,7 +3947,7 @@
                 <w:sz w:val="18"/>
                 <w:szCs w:val="18"/>
               </w:rPr>
-              <w:t xml:space="preserve">4.56</w:t>
+              <w:t xml:space="preserve">00.0</w:t>
             </w:r>
           </w:p>
         </w:tc>
@@ -3979,7 +3979,7 @@
                 <w:sz w:val="18"/>
                 <w:szCs w:val="18"/>
               </w:rPr>
-              <w:t xml:space="preserve">70</w:t>
+              <w:t xml:space="preserve">00</w:t>
             </w:r>
           </w:p>
         </w:tc>
@@ -4011,7 +4011,7 @@
                 <w:sz w:val="18"/>
                 <w:szCs w:val="18"/>
               </w:rPr>
-              <w:t xml:space="preserve">0.76</w:t>
+              <w:t xml:space="preserve">00.0</w:t>
             </w:r>
           </w:p>
         </w:tc>
@@ -4043,7 +4043,7 @@
                 <w:sz w:val="18"/>
                 <w:szCs w:val="18"/>
               </w:rPr>
-              <w:t xml:space="preserve">129</w:t>
+              <w:t xml:space="preserve">00</w:t>
             </w:r>
           </w:p>
         </w:tc>
@@ -4075,7 +4075,7 @@
                 <w:sz w:val="18"/>
                 <w:szCs w:val="18"/>
               </w:rPr>
-              <w:t xml:space="preserve">1.50</w:t>
+              <w:t xml:space="preserve">00.0</w:t>
             </w:r>
           </w:p>
         </w:tc>
@@ -4108,7 +4108,7 @@
                 <w:sz w:val="18"/>
                 <w:szCs w:val="18"/>
               </w:rPr>
-              <w:t xml:space="preserve">Pressure Management</w:t>
+              <w:t xml:space="preserve">Workstream A</w:t>
             </w:r>
           </w:p>
         </w:tc>
@@ -4170,7 +4170,7 @@
                 <w:sz w:val="18"/>
                 <w:szCs w:val="18"/>
               </w:rPr>
-              <w:t xml:space="preserve">12.10</w:t>
+              <w:t xml:space="preserve">00.0</w:t>
             </w:r>
           </w:p>
         </w:tc>
@@ -4232,7 +4232,7 @@
                 <w:sz w:val="18"/>
                 <w:szCs w:val="18"/>
               </w:rPr>
-              <w:t xml:space="preserve">2.02</w:t>
+              <w:t xml:space="preserve">00.0</w:t>
             </w:r>
           </w:p>
         </w:tc>
@@ -4294,7 +4294,7 @@
                 <w:sz w:val="18"/>
                 <w:szCs w:val="18"/>
               </w:rPr>
-              <w:t xml:space="preserve">2.23</w:t>
+              <w:t xml:space="preserve">00.0</w:t>
             </w:r>
           </w:p>
         </w:tc>
@@ -4360,7 +4360,7 @@
                 <w:sz w:val="18"/>
                 <w:szCs w:val="18"/>
               </w:rPr>
-              <w:t xml:space="preserve">7,320</w:t>
+              <w:t xml:space="preserve">0,000</w:t>
             </w:r>
           </w:p>
         </w:tc>
@@ -4392,7 +4392,7 @@
                 <w:sz w:val="18"/>
                 <w:szCs w:val="18"/>
               </w:rPr>
-              <w:t xml:space="preserve">99.9</w:t>
+              <w:t xml:space="preserve">00.0</w:t>
             </w:r>
           </w:p>
         </w:tc>
@@ -4424,7 +4424,7 @@
                 <w:sz w:val="18"/>
                 <w:szCs w:val="18"/>
               </w:rPr>
-              <w:t xml:space="preserve">1,220</w:t>
+              <w:t xml:space="preserve">0,000</w:t>
             </w:r>
           </w:p>
         </w:tc>
@@ -4456,7 +4456,7 @@
                 <w:sz w:val="18"/>
                 <w:szCs w:val="18"/>
               </w:rPr>
-              <w:t xml:space="preserve">16.66</w:t>
+              <w:t xml:space="preserve">00.0</w:t>
             </w:r>
           </w:p>
         </w:tc>
@@ -4488,7 +4488,7 @@
                 <w:sz w:val="18"/>
                 <w:szCs w:val="18"/>
               </w:rPr>
-              <w:t xml:space="preserve">1,681</w:t>
+              <w:t xml:space="preserve">0,000</w:t>
             </w:r>
           </w:p>
         </w:tc>
@@ -4520,7 +4520,7 @@
                 <w:sz w:val="18"/>
                 <w:szCs w:val="18"/>
               </w:rPr>
-              <w:t xml:space="preserve">23.61</w:t>
+              <w:t xml:space="preserve">00.0</w:t>
             </w:r>
           </w:p>
         </w:tc>
@@ -4578,7 +4578,7 @@
           <w:sz w:val="22"/>
           <w:szCs w:val="22"/>
         </w:rPr>
-        <w:t xml:space="preserve">Four key workstreams, comprising eight individual projects, form the core of Aqualogic's portfolio supporting South West Water's leakage-reduction programme: Pressure Management, Upstream Losses, DMA Optimisation and iQuarius+.</w:t>
+        <w:t xml:space="preserve">Lorem ipsum dolor sit amet, consectetur adipiscing elit. Sed do eiusmod tempor incididunt ut labore et dolore magna aliqua. Ut enim ad minim veniam, quis nostrud exercitation ullamco laboris nisi ut aliquip ex ea commodo consequat.</w:t>
       </w:r>
     </w:p>
     <w:p>
@@ -4597,7 +4597,7 @@
           <w:sz w:val="22"/>
           <w:szCs w:val="22"/>
         </w:rPr>
-        <w:t xml:space="preserve">Pressure Management.  </w:t>
+        <w:t xml:space="preserve">Workstream one.  </w:t>
       </w:r>
       <w:r>
         <w:rPr>
@@ -4610,7 +4610,7 @@
           <w:sz w:val="22"/>
           <w:szCs w:val="22"/>
         </w:rPr>
-        <w:t xml:space="preserve">This workstream focuses on optimising and stabilising pressures across South West Water's network to increase asset life, reduce bursts and decrease background leakage. The projects within it are Pressure Reduction Valve (PRV) servicing, new PRV design and installation, new electronic controller installations and existing controller optimisations.</w:t>
+        <w:t xml:space="preserve">Lorem ipsum dolor sit amet, consectetur adipiscing elit. Sed do eiusmod tempor incididunt ut labore et dolore magna aliqua. Ut enim ad minim veniam, quis nostrud exercitation ullamco laboris nisi ut aliquip ex ea commodo consequat. Duis aute irure dolor in reprehenderit in voluptate velit esse cillum dolore eu fugiat nulla pariatur.</w:t>
       </w:r>
     </w:p>
     <w:p>
@@ -4629,7 +4629,7 @@
           <w:sz w:val="22"/>
           <w:szCs w:val="22"/>
         </w:rPr>
-        <w:t xml:space="preserve">Upstream Losses.  </w:t>
+        <w:t xml:space="preserve">Workstream two.  </w:t>
       </w:r>
       <w:r>
         <w:rPr>
@@ -4642,7 +4642,7 @@
           <w:sz w:val="22"/>
           <w:szCs w:val="22"/>
         </w:rPr>
-        <w:t xml:space="preserve">Across the South West Water operating region, approximately 45,000 customer connections lie outside the established District Metered Area (DMA) estate, spread across 2,757 kilometres of distribution and trunk main. This workstream is dedicated to identifying, locating and quantifying leakage on these assets, where visibility is inherently lower and the potential scale of water loss is significantly larger.</w:t>
+        <w:t xml:space="preserve">Lorem ipsum dolor sit amet, consectetur adipiscing elit. Sed do eiusmod tempor incididunt ut labore et dolore magna aliqua. Ut enim ad minim veniam, quis nostrud exercitation ullamco laboris nisi ut aliquip ex ea commodo consequat. Duis aute irure dolor in reprehenderit in voluptate velit esse cillum dolore eu fugiat nulla pariatur.</w:t>
       </w:r>
     </w:p>
     <w:p>
@@ -4661,7 +4661,7 @@
           <w:sz w:val="22"/>
           <w:szCs w:val="22"/>
         </w:rPr>
-        <w:t xml:space="preserve">DMA Optimisation.  </w:t>
+        <w:t xml:space="preserve">Workstream three.  </w:t>
       </w:r>
       <w:r>
         <w:rPr>
@@ -4674,7 +4674,7 @@
           <w:sz w:val="22"/>
           <w:szCs w:val="22"/>
         </w:rPr>
-        <w:t xml:space="preserve">Aqualogic takes full operational ownership of agreed operable and inoperable DMAs. Alongside the day-to-day management of leakage increases in operable DMAs, Aqualogic applies a best-practice optimisation methodology to move each DMA toward its lowest achievable leakage level, including analysing consumption and nightlines, validating meter performance, improving data integrity, and deploying targeted interventions. The workstream also assures that leakage within inoperable DMAs is proactively managed, maintaining control even where full DMA functionality is compromised. Together, these projects deliver a sustained reduction in leakage, improved network reliability and increased operational efficiency.</w:t>
+        <w:t xml:space="preserve">Lorem ipsum dolor sit amet, consectetur adipiscing elit. Sed do eiusmod tempor incididunt ut labore et dolore magna aliqua. Ut enim ad minim veniam, quis nostrud exercitation ullamco laboris nisi ut aliquip ex ea commodo consequat. Duis aute irure dolor in reprehenderit in voluptate velit esse cillum dolore eu fugiat nulla pariatur. Excepteur sint occaecat cupidatat non proident, sunt in culpa qui officia deserunt mollit anim id est laborum. Curabitur pretium tincidunt lacus.</w:t>
       </w:r>
     </w:p>
     <w:p>
@@ -4693,7 +4693,7 @@
           <w:sz w:val="22"/>
           <w:szCs w:val="22"/>
         </w:rPr>
-        <w:t xml:space="preserve">iQuarius+.  </w:t>
+        <w:t xml:space="preserve">Workstream four.  </w:t>
       </w:r>
       <w:r>
         <w:rPr>
@@ -4706,7 +4706,7 @@
           <w:sz w:val="22"/>
           <w:szCs w:val="22"/>
         </w:rPr>
-        <w:t xml:space="preserve">This workstream targets routine leakage across 474 proven DMAs, where the methodology has demonstrated sustained success. Using mobile iQ100b devices, the teams collect, manage and analyse leakage data to achieve industry-leading detection performance. The methodology removes subjectivity from leak detection and enables newly trained technicians to become effective immediately, sustaining high productivity across the operating region despite the limited availability of skilled resources.</w:t>
+        <w:t xml:space="preserve">Lorem ipsum dolor sit amet, consectetur adipiscing elit. Sed do eiusmod tempor incididunt ut labore et dolore magna aliqua. Ut enim ad minim veniam, quis nostrud exercitation ullamco laboris nisi ut aliquip ex ea commodo consequat. Duis aute irure dolor in reprehenderit in voluptate velit esse cillum dolore eu fugiat nulla pariatur.</w:t>
       </w:r>
     </w:p>
     <w:p>
@@ -4761,7 +4761,7 @@
           <w:sz w:val="22"/>
           <w:szCs w:val="22"/>
         </w:rPr>
-        <w:t xml:space="preserve">The table below sets out the primary service level agreement, key performance indicator, budget and cost benefit for each project across the portfolio.</w:t>
+        <w:t xml:space="preserve">Lorem ipsum dolor sit amet, consectetur adipiscing elit. Sed do eiusmod tempor incididunt ut labore et dolore magna aliqua.</w:t>
       </w:r>
     </w:p>
     <w:tbl>
@@ -5010,7 +5010,7 @@
                 <w:sz w:val="18"/>
                 <w:szCs w:val="18"/>
               </w:rPr>
-              <w:t xml:space="preserve">Pressure Management</w:t>
+              <w:t xml:space="preserve">Workstream A</w:t>
             </w:r>
           </w:p>
         </w:tc>
@@ -5041,7 +5041,7 @@
                 <w:sz w:val="18"/>
                 <w:szCs w:val="18"/>
               </w:rPr>
-              <w:t xml:space="preserve">PRV Servicing</w:t>
+              <w:t xml:space="preserve">Project 1</w:t>
             </w:r>
           </w:p>
         </w:tc>
@@ -5072,7 +5072,7 @@
                 <w:sz w:val="18"/>
                 <w:szCs w:val="18"/>
               </w:rPr>
-              <w:t xml:space="preserve">7.28</w:t>
+              <w:t xml:space="preserve">00.0</w:t>
             </w:r>
           </w:p>
         </w:tc>
@@ -5103,7 +5103,7 @@
                 <w:sz w:val="18"/>
                 <w:szCs w:val="18"/>
               </w:rPr>
-              <w:t xml:space="preserve">150 Services</w:t>
+              <w:t xml:space="preserve">[volume]</w:t>
             </w:r>
           </w:p>
         </w:tc>
@@ -5134,7 +5134,7 @@
                 <w:sz w:val="18"/>
                 <w:szCs w:val="18"/>
               </w:rPr>
-              <w:t xml:space="preserve">0.71</w:t>
+              <w:t xml:space="preserve">00.0</w:t>
             </w:r>
           </w:p>
         </w:tc>
@@ -5165,7 +5165,7 @@
                 <w:sz w:val="18"/>
                 <w:szCs w:val="18"/>
               </w:rPr>
-              <w:t xml:space="preserve">98</w:t>
+              <w:t xml:space="preserve">00</w:t>
             </w:r>
           </w:p>
         </w:tc>
@@ -5199,7 +5199,7 @@
                 <w:sz w:val="18"/>
                 <w:szCs w:val="18"/>
               </w:rPr>
-              <w:t xml:space="preserve">Pressure Management</w:t>
+              <w:t xml:space="preserve">Workstream A</w:t>
             </w:r>
           </w:p>
         </w:tc>
@@ -5231,7 +5231,7 @@
                 <w:sz w:val="18"/>
                 <w:szCs w:val="18"/>
               </w:rPr>
-              <w:t xml:space="preserve">New Scheme Designs</w:t>
+              <w:t xml:space="preserve">Project 2</w:t>
             </w:r>
           </w:p>
         </w:tc>
@@ -5263,7 +5263,7 @@
                 <w:sz w:val="18"/>
                 <w:szCs w:val="18"/>
               </w:rPr>
-              <w:t xml:space="preserve">2.55</w:t>
+              <w:t xml:space="preserve">00.0</w:t>
             </w:r>
           </w:p>
         </w:tc>
@@ -5295,7 +5295,7 @@
                 <w:sz w:val="18"/>
                 <w:szCs w:val="18"/>
               </w:rPr>
-              <w:t xml:space="preserve">35 Schemes</w:t>
+              <w:t xml:space="preserve">[volume]</w:t>
             </w:r>
           </w:p>
         </w:tc>
@@ -5327,7 +5327,7 @@
                 <w:sz w:val="18"/>
                 <w:szCs w:val="18"/>
               </w:rPr>
-              <w:t xml:space="preserve">0.25</w:t>
+              <w:t xml:space="preserve">00.0</w:t>
             </w:r>
           </w:p>
         </w:tc>
@@ -5359,7 +5359,7 @@
                 <w:sz w:val="18"/>
                 <w:szCs w:val="18"/>
               </w:rPr>
-              <w:t xml:space="preserve">98</w:t>
+              <w:t xml:space="preserve">00</w:t>
             </w:r>
           </w:p>
         </w:tc>
@@ -5392,7 +5392,7 @@
                 <w:sz w:val="18"/>
                 <w:szCs w:val="18"/>
               </w:rPr>
-              <w:t xml:space="preserve">Pressure Management</w:t>
+              <w:t xml:space="preserve">Workstream A</w:t>
             </w:r>
           </w:p>
         </w:tc>
@@ -5423,7 +5423,7 @@
                 <w:sz w:val="18"/>
                 <w:szCs w:val="18"/>
               </w:rPr>
-              <w:t xml:space="preserve">New Controller Schemes</w:t>
+              <w:t xml:space="preserve">Project 3</w:t>
             </w:r>
           </w:p>
         </w:tc>
@@ -5454,7 +5454,7 @@
                 <w:sz w:val="18"/>
                 <w:szCs w:val="18"/>
               </w:rPr>
-              <w:t xml:space="preserve">1.00</w:t>
+              <w:t xml:space="preserve">00.0</w:t>
             </w:r>
           </w:p>
         </w:tc>
@@ -5485,7 +5485,7 @@
                 <w:sz w:val="18"/>
                 <w:szCs w:val="18"/>
               </w:rPr>
-              <w:t xml:space="preserve">50 Schemes</w:t>
+              <w:t xml:space="preserve">[volume]</w:t>
             </w:r>
           </w:p>
         </w:tc>
@@ -5516,7 +5516,7 @@
                 <w:sz w:val="18"/>
                 <w:szCs w:val="18"/>
               </w:rPr>
-              <w:t xml:space="preserve">0.09</w:t>
+              <w:t xml:space="preserve">00.0</w:t>
             </w:r>
           </w:p>
         </w:tc>
@@ -5547,7 +5547,7 @@
                 <w:sz w:val="18"/>
                 <w:szCs w:val="18"/>
               </w:rPr>
-              <w:t xml:space="preserve">95</w:t>
+              <w:t xml:space="preserve">00</w:t>
             </w:r>
           </w:p>
         </w:tc>
@@ -5581,7 +5581,7 @@
                 <w:sz w:val="18"/>
                 <w:szCs w:val="18"/>
               </w:rPr>
-              <w:t xml:space="preserve">Pressure Management</w:t>
+              <w:t xml:space="preserve">Workstream A</w:t>
             </w:r>
           </w:p>
         </w:tc>
@@ -5613,7 +5613,7 @@
                 <w:sz w:val="18"/>
                 <w:szCs w:val="18"/>
               </w:rPr>
-              <w:t xml:space="preserve">Controller Optimisations</w:t>
+              <w:t xml:space="preserve">Project 4</w:t>
             </w:r>
           </w:p>
         </w:tc>
@@ -5645,7 +5645,7 @@
                 <w:sz w:val="18"/>
                 <w:szCs w:val="18"/>
               </w:rPr>
-              <w:t xml:space="preserve">1.27</w:t>
+              <w:t xml:space="preserve">00.0</w:t>
             </w:r>
           </w:p>
         </w:tc>
@@ -5677,7 +5677,7 @@
                 <w:sz w:val="18"/>
                 <w:szCs w:val="18"/>
               </w:rPr>
-              <w:t xml:space="preserve">80 Optimisations</w:t>
+              <w:t xml:space="preserve">[volume]</w:t>
             </w:r>
           </w:p>
         </w:tc>
@@ -5709,7 +5709,7 @@
                 <w:sz w:val="18"/>
                 <w:szCs w:val="18"/>
               </w:rPr>
-              <w:t xml:space="preserve">0.13</w:t>
+              <w:t xml:space="preserve">00.0</w:t>
             </w:r>
           </w:p>
         </w:tc>
@@ -5741,7 +5741,7 @@
                 <w:sz w:val="18"/>
                 <w:szCs w:val="18"/>
               </w:rPr>
-              <w:t xml:space="preserve">102</w:t>
+              <w:t xml:space="preserve">00</w:t>
             </w:r>
           </w:p>
         </w:tc>
@@ -5774,7 +5774,7 @@
                 <w:sz w:val="18"/>
                 <w:szCs w:val="18"/>
               </w:rPr>
-              <w:t xml:space="preserve">Upstream Losses</w:t>
+              <w:t xml:space="preserve">Workstream B</w:t>
             </w:r>
           </w:p>
         </w:tc>
@@ -5805,7 +5805,7 @@
                 <w:sz w:val="18"/>
                 <w:szCs w:val="18"/>
               </w:rPr>
-              <w:t xml:space="preserve">Upstream Losses</w:t>
+              <w:t xml:space="preserve">Workstream B</w:t>
             </w:r>
           </w:p>
         </w:tc>
@@ -5836,7 +5836,7 @@
                 <w:sz w:val="18"/>
                 <w:szCs w:val="18"/>
               </w:rPr>
-              <w:t xml:space="preserve">24.00</w:t>
+              <w:t xml:space="preserve">00.0</w:t>
             </w:r>
           </w:p>
         </w:tc>
@@ -5867,7 +5867,7 @@
                 <w:sz w:val="18"/>
                 <w:szCs w:val="18"/>
               </w:rPr>
-              <w:t xml:space="preserve">1,860 Detected Leaks</w:t>
+              <w:t xml:space="preserve">[detected leaks]</w:t>
             </w:r>
           </w:p>
         </w:tc>
@@ -5898,7 +5898,7 @@
                 <w:sz w:val="18"/>
                 <w:szCs w:val="18"/>
               </w:rPr>
-              <w:t xml:space="preserve">2.63</w:t>
+              <w:t xml:space="preserve">00.0</w:t>
             </w:r>
           </w:p>
         </w:tc>
@@ -5929,7 +5929,7 @@
                 <w:sz w:val="18"/>
                 <w:szCs w:val="18"/>
               </w:rPr>
-              <w:t xml:space="preserve">109</w:t>
+              <w:t xml:space="preserve">00</w:t>
             </w:r>
           </w:p>
         </w:tc>
@@ -5963,7 +5963,7 @@
                 <w:sz w:val="18"/>
                 <w:szCs w:val="18"/>
               </w:rPr>
-              <w:t xml:space="preserve">DMA Optimisation</w:t>
+              <w:t xml:space="preserve">Workstream C</w:t>
             </w:r>
           </w:p>
         </w:tc>
@@ -5995,7 +5995,7 @@
                 <w:sz w:val="18"/>
                 <w:szCs w:val="18"/>
               </w:rPr>
-              <w:t xml:space="preserve">Operable</w:t>
+              <w:t xml:space="preserve">Project 5</w:t>
             </w:r>
           </w:p>
         </w:tc>
@@ -6027,7 +6027,7 @@
                 <w:sz w:val="18"/>
                 <w:szCs w:val="18"/>
               </w:rPr>
-              <w:t xml:space="preserve">11.28</w:t>
+              <w:t xml:space="preserve">00.0</w:t>
             </w:r>
           </w:p>
         </w:tc>
@@ -6059,7 +6059,7 @@
                 <w:sz w:val="18"/>
                 <w:szCs w:val="18"/>
               </w:rPr>
-              <w:t xml:space="preserve">528 Detected Leaks</w:t>
+              <w:t xml:space="preserve">[detected leaks]</w:t>
             </w:r>
           </w:p>
         </w:tc>
@@ -6091,7 +6091,7 @@
                 <w:sz w:val="18"/>
                 <w:szCs w:val="18"/>
               </w:rPr>
-              <w:t xml:space="preserve">1.11</w:t>
+              <w:t xml:space="preserve">00.0</w:t>
             </w:r>
           </w:p>
         </w:tc>
@@ -6123,7 +6123,7 @@
                 <w:sz w:val="18"/>
                 <w:szCs w:val="18"/>
               </w:rPr>
-              <w:t xml:space="preserve">98</w:t>
+              <w:t xml:space="preserve">00</w:t>
             </w:r>
           </w:p>
         </w:tc>
@@ -6156,7 +6156,7 @@
                 <w:sz w:val="18"/>
                 <w:szCs w:val="18"/>
               </w:rPr>
-              <w:t xml:space="preserve">DMA Optimisation</w:t>
+              <w:t xml:space="preserve">Workstream C</w:t>
             </w:r>
           </w:p>
         </w:tc>
@@ -6187,7 +6187,7 @@
                 <w:sz w:val="18"/>
                 <w:szCs w:val="18"/>
               </w:rPr>
-              <w:t xml:space="preserve">Inoperable</w:t>
+              <w:t xml:space="preserve">Project 6</w:t>
             </w:r>
           </w:p>
         </w:tc>
@@ -6218,7 +6218,7 @@
                 <w:sz w:val="18"/>
                 <w:szCs w:val="18"/>
               </w:rPr>
-              <w:t xml:space="preserve">4.56</w:t>
+              <w:t xml:space="preserve">00.0</w:t>
             </w:r>
           </w:p>
         </w:tc>
@@ -6249,7 +6249,7 @@
                 <w:sz w:val="18"/>
                 <w:szCs w:val="18"/>
               </w:rPr>
-              <w:t xml:space="preserve">420 Detected Leaks</w:t>
+              <w:t xml:space="preserve">[detected leaks]</w:t>
             </w:r>
           </w:p>
         </w:tc>
@@ -6280,7 +6280,7 @@
                 <w:sz w:val="18"/>
                 <w:szCs w:val="18"/>
               </w:rPr>
-              <w:t xml:space="preserve">0.48</w:t>
+              <w:t xml:space="preserve">00.0</w:t>
             </w:r>
           </w:p>
         </w:tc>
@@ -6311,7 +6311,7 @@
                 <w:sz w:val="18"/>
                 <w:szCs w:val="18"/>
               </w:rPr>
-              <w:t xml:space="preserve">104</w:t>
+              <w:t xml:space="preserve">00</w:t>
             </w:r>
           </w:p>
         </w:tc>
@@ -6345,7 +6345,7 @@
                 <w:sz w:val="18"/>
                 <w:szCs w:val="18"/>
               </w:rPr>
-              <w:t xml:space="preserve">iQuarius+</w:t>
+              <w:t xml:space="preserve">Workstream D</w:t>
             </w:r>
           </w:p>
         </w:tc>
@@ -6377,7 +6377,7 @@
                 <w:sz w:val="18"/>
                 <w:szCs w:val="18"/>
               </w:rPr>
-              <w:t xml:space="preserve">iQuarius+</w:t>
+              <w:t xml:space="preserve">Workstream D</w:t>
             </w:r>
           </w:p>
         </w:tc>
@@ -6409,7 +6409,7 @@
                 <w:sz w:val="18"/>
                 <w:szCs w:val="18"/>
               </w:rPr>
-              <w:t xml:space="preserve">48</w:t>
+              <w:t xml:space="preserve">00</w:t>
             </w:r>
           </w:p>
         </w:tc>
@@ -6441,7 +6441,7 @@
                 <w:sz w:val="18"/>
                 <w:szCs w:val="18"/>
               </w:rPr>
-              <w:t xml:space="preserve">4,512 Detected Leaks</w:t>
+              <w:t xml:space="preserve">[detected leaks]</w:t>
             </w:r>
           </w:p>
         </w:tc>
@@ -6473,7 +6473,7 @@
                 <w:sz w:val="18"/>
                 <w:szCs w:val="18"/>
               </w:rPr>
-              <w:t xml:space="preserve">4.24</w:t>
+              <w:t xml:space="preserve">00.0</w:t>
             </w:r>
           </w:p>
         </w:tc>
@@ -6505,7 +6505,7 @@
                 <w:sz w:val="18"/>
                 <w:szCs w:val="18"/>
               </w:rPr>
-              <w:t xml:space="preserve">88</w:t>
+              <w:t xml:space="preserve">00</w:t>
             </w:r>
           </w:p>
         </w:tc>
@@ -6603,7 +6603,7 @@
                 <w:sz w:val="18"/>
                 <w:szCs w:val="18"/>
               </w:rPr>
-              <w:t xml:space="preserve">99.9</w:t>
+              <w:t xml:space="preserve">00.0</w:t>
             </w:r>
           </w:p>
         </w:tc>
@@ -6667,7 +6667,7 @@
                 <w:sz w:val="18"/>
                 <w:szCs w:val="18"/>
               </w:rPr>
-              <w:t xml:space="preserve">9.64</w:t>
+              <w:t xml:space="preserve">00.0</w:t>
             </w:r>
           </w:p>
         </w:tc>
@@ -6699,7 +6699,7 @@
                 <w:sz w:val="18"/>
                 <w:szCs w:val="18"/>
               </w:rPr>
-              <w:t xml:space="preserve">97</w:t>
+              <w:t xml:space="preserve">00</w:t>
             </w:r>
           </w:p>
         </w:tc>
@@ -6757,7 +6757,7 @@
           <w:sz w:val="22"/>
           <w:szCs w:val="22"/>
         </w:rPr>
-        <w:t xml:space="preserve">Should South West Water wish to scale activities, whether to deliver greater reportable leakage savings, maximise distribution input reductions, or optimise budgets based on risk profile, the following table should be considered when making decisions.</w:t>
+        <w:t xml:space="preserve">Lorem ipsum dolor sit amet, consectetur adipiscing elit. Sed do eiusmod tempor incididunt ut labore et dolore magna aliqua. Ut enim ad minim veniam, quis nostrud exercitation ullamco laboris nisi ut aliquip ex ea commodo consequat.</w:t>
       </w:r>
     </w:p>
     <w:p>
@@ -6776,7 +6776,7 @@
           <w:sz w:val="22"/>
           <w:szCs w:val="22"/>
         </w:rPr>
-        <w:t xml:space="preserve">The Budget Optimisation column highlights the potential risk of increased leakage from discontinuing or reducing activity in a workstream, weighed against the budgetary benefit. The Scalability Potential column indicates the practicality of expanding the project activity and the likely scale of leakage benefit that could be achieved.</w:t>
+        <w:t xml:space="preserve">Lorem ipsum dolor sit amet, consectetur adipiscing elit. Sed do eiusmod tempor incididunt ut labore et dolore magna aliqua. Ut enim ad minim veniam, quis nostrud exercitation ullamco laboris nisi ut aliquip ex ea commodo consequat.</w:t>
       </w:r>
     </w:p>
     <w:tbl>
@@ -6992,7 +6992,7 @@
                 <w:sz w:val="18"/>
                 <w:szCs w:val="18"/>
               </w:rPr>
-              <w:t xml:space="preserve">PRV Servicing</w:t>
+              <w:t xml:space="preserve">Project 1</w:t>
             </w:r>
           </w:p>
         </w:tc>
@@ -7023,7 +7023,7 @@
                 <w:sz w:val="18"/>
                 <w:szCs w:val="18"/>
               </w:rPr>
-              <w:t xml:space="preserve">Essential</w:t>
+              <w:t xml:space="preserve">[rating]</w:t>
             </w:r>
           </w:p>
         </w:tc>
@@ -7054,7 +7054,7 @@
                 <w:sz w:val="18"/>
                 <w:szCs w:val="18"/>
               </w:rPr>
-              <w:t xml:space="preserve">Essential</w:t>
+              <w:t xml:space="preserve">[rating]</w:t>
             </w:r>
           </w:p>
         </w:tc>
@@ -7085,7 +7085,7 @@
                 <w:sz w:val="18"/>
                 <w:szCs w:val="18"/>
               </w:rPr>
-              <w:t xml:space="preserve">High risk / Medium benefit</w:t>
+              <w:t xml:space="preserve">[risk / benefit]</w:t>
             </w:r>
           </w:p>
         </w:tc>
@@ -7116,7 +7116,7 @@
                 <w:sz w:val="18"/>
                 <w:szCs w:val="18"/>
               </w:rPr>
-              <w:t xml:space="preserve">High / Medium</w:t>
+              <w:t xml:space="preserve">[scalability]</w:t>
             </w:r>
           </w:p>
         </w:tc>
@@ -7150,7 +7150,7 @@
                 <w:sz w:val="18"/>
                 <w:szCs w:val="18"/>
               </w:rPr>
-              <w:t xml:space="preserve">New Scheme Designs/Installations</w:t>
+              <w:t xml:space="preserve">Project 2</w:t>
             </w:r>
           </w:p>
         </w:tc>
@@ -7182,7 +7182,7 @@
                 <w:sz w:val="18"/>
                 <w:szCs w:val="18"/>
               </w:rPr>
-              <w:t xml:space="preserve">Essential</w:t>
+              <w:t xml:space="preserve">[rating]</w:t>
             </w:r>
           </w:p>
         </w:tc>
@@ -7214,7 +7214,7 @@
                 <w:sz w:val="18"/>
                 <w:szCs w:val="18"/>
               </w:rPr>
-              <w:t xml:space="preserve">Essential</w:t>
+              <w:t xml:space="preserve">[rating]</w:t>
             </w:r>
           </w:p>
         </w:tc>
@@ -7246,7 +7246,7 @@
                 <w:sz w:val="18"/>
                 <w:szCs w:val="18"/>
               </w:rPr>
-              <w:t xml:space="preserve">Medium risk / Low benefit</w:t>
+              <w:t xml:space="preserve">[risk / benefit]</w:t>
             </w:r>
           </w:p>
         </w:tc>
@@ -7278,7 +7278,7 @@
                 <w:sz w:val="18"/>
                 <w:szCs w:val="18"/>
               </w:rPr>
-              <w:t xml:space="preserve">Medium / Medium</w:t>
+              <w:t xml:space="preserve">[scalability]</w:t>
             </w:r>
           </w:p>
         </w:tc>
@@ -7311,7 +7311,7 @@
                 <w:sz w:val="18"/>
                 <w:szCs w:val="18"/>
               </w:rPr>
-              <w:t xml:space="preserve">New Controller Schemes/Installations</w:t>
+              <w:t xml:space="preserve">Project 3</w:t>
             </w:r>
           </w:p>
         </w:tc>
@@ -7342,7 +7342,7 @@
                 <w:sz w:val="18"/>
                 <w:szCs w:val="18"/>
               </w:rPr>
-              <w:t xml:space="preserve">Desirable</w:t>
+              <w:t xml:space="preserve">[rating]</w:t>
             </w:r>
           </w:p>
         </w:tc>
@@ -7373,7 +7373,7 @@
                 <w:sz w:val="18"/>
                 <w:szCs w:val="18"/>
               </w:rPr>
-              <w:t xml:space="preserve">Desirable</w:t>
+              <w:t xml:space="preserve">[rating]</w:t>
             </w:r>
           </w:p>
         </w:tc>
@@ -7404,7 +7404,7 @@
                 <w:sz w:val="18"/>
                 <w:szCs w:val="18"/>
               </w:rPr>
-              <w:t xml:space="preserve">Low risk / Low benefit</w:t>
+              <w:t xml:space="preserve">[risk / benefit]</w:t>
             </w:r>
           </w:p>
         </w:tc>
@@ -7435,7 +7435,7 @@
                 <w:sz w:val="18"/>
                 <w:szCs w:val="18"/>
               </w:rPr>
-              <w:t xml:space="preserve">Low / Low</w:t>
+              <w:t xml:space="preserve">[scalability]</w:t>
             </w:r>
           </w:p>
         </w:tc>
@@ -7469,7 +7469,7 @@
                 <w:sz w:val="18"/>
                 <w:szCs w:val="18"/>
               </w:rPr>
-              <w:t xml:space="preserve">Controller Optimisations</w:t>
+              <w:t xml:space="preserve">Project 4</w:t>
             </w:r>
           </w:p>
         </w:tc>
@@ -7501,7 +7501,7 @@
                 <w:sz w:val="18"/>
                 <w:szCs w:val="18"/>
               </w:rPr>
-              <w:t xml:space="preserve">Desirable</w:t>
+              <w:t xml:space="preserve">[rating]</w:t>
             </w:r>
           </w:p>
         </w:tc>
@@ -7533,7 +7533,7 @@
                 <w:sz w:val="18"/>
                 <w:szCs w:val="18"/>
               </w:rPr>
-              <w:t xml:space="preserve">Desirable</w:t>
+              <w:t xml:space="preserve">[rating]</w:t>
             </w:r>
           </w:p>
         </w:tc>
@@ -7565,7 +7565,7 @@
                 <w:sz w:val="18"/>
                 <w:szCs w:val="18"/>
               </w:rPr>
-              <w:t xml:space="preserve">Low risk / Low benefit</w:t>
+              <w:t xml:space="preserve">[risk / benefit]</w:t>
             </w:r>
           </w:p>
         </w:tc>
@@ -7597,7 +7597,7 @@
                 <w:sz w:val="18"/>
                 <w:szCs w:val="18"/>
               </w:rPr>
-              <w:t xml:space="preserve">Low / Low</w:t>
+              <w:t xml:space="preserve">[scalability]</w:t>
             </w:r>
           </w:p>
         </w:tc>
@@ -7630,7 +7630,7 @@
                 <w:sz w:val="18"/>
                 <w:szCs w:val="18"/>
               </w:rPr>
-              <w:t xml:space="preserve">Upstream Losses</w:t>
+              <w:t xml:space="preserve">Workstream B</w:t>
             </w:r>
           </w:p>
         </w:tc>
@@ -7661,7 +7661,7 @@
                 <w:sz w:val="18"/>
                 <w:szCs w:val="18"/>
               </w:rPr>
-              <w:t xml:space="preserve">Desirable</w:t>
+              <w:t xml:space="preserve">[rating]</w:t>
             </w:r>
           </w:p>
         </w:tc>
@@ -7692,7 +7692,7 @@
                 <w:sz w:val="18"/>
                 <w:szCs w:val="18"/>
               </w:rPr>
-              <w:t xml:space="preserve">Essential</w:t>
+              <w:t xml:space="preserve">[rating]</w:t>
             </w:r>
           </w:p>
         </w:tc>
@@ -7723,7 +7723,7 @@
                 <w:sz w:val="18"/>
                 <w:szCs w:val="18"/>
               </w:rPr>
-              <w:t xml:space="preserve">High risk / High benefit</w:t>
+              <w:t xml:space="preserve">[risk / benefit]</w:t>
             </w:r>
           </w:p>
         </w:tc>
@@ -7754,7 +7754,7 @@
                 <w:sz w:val="18"/>
                 <w:szCs w:val="18"/>
               </w:rPr>
-              <w:t xml:space="preserve">Medium / High</w:t>
+              <w:t xml:space="preserve">[scalability]</w:t>
             </w:r>
           </w:p>
         </w:tc>
@@ -7788,7 +7788,7 @@
                 <w:sz w:val="18"/>
                 <w:szCs w:val="18"/>
               </w:rPr>
-              <w:t xml:space="preserve">Operable</w:t>
+              <w:t xml:space="preserve">Project 5</w:t>
             </w:r>
           </w:p>
         </w:tc>
@@ -7820,7 +7820,7 @@
                 <w:sz w:val="18"/>
                 <w:szCs w:val="18"/>
               </w:rPr>
-              <w:t xml:space="preserve">Essential</w:t>
+              <w:t xml:space="preserve">[rating]</w:t>
             </w:r>
           </w:p>
         </w:tc>
@@ -7852,7 +7852,7 @@
                 <w:sz w:val="18"/>
                 <w:szCs w:val="18"/>
               </w:rPr>
-              <w:t xml:space="preserve">Essential</w:t>
+              <w:t xml:space="preserve">[rating]</w:t>
             </w:r>
           </w:p>
         </w:tc>
@@ -7884,7 +7884,7 @@
                 <w:sz w:val="18"/>
                 <w:szCs w:val="18"/>
               </w:rPr>
-              <w:t xml:space="preserve">High risk / Medium benefit</w:t>
+              <w:t xml:space="preserve">[risk / benefit]</w:t>
             </w:r>
           </w:p>
         </w:tc>
@@ -7916,7 +7916,7 @@
                 <w:sz w:val="18"/>
                 <w:szCs w:val="18"/>
               </w:rPr>
-              <w:t xml:space="preserve">High / High</w:t>
+              <w:t xml:space="preserve">[scalability]</w:t>
             </w:r>
           </w:p>
         </w:tc>
@@ -7949,7 +7949,7 @@
                 <w:sz w:val="18"/>
                 <w:szCs w:val="18"/>
               </w:rPr>
-              <w:t xml:space="preserve">Inoperable</w:t>
+              <w:t xml:space="preserve">Project 6</w:t>
             </w:r>
           </w:p>
         </w:tc>
@@ -7980,7 +7980,7 @@
                 <w:sz w:val="18"/>
                 <w:szCs w:val="18"/>
               </w:rPr>
-              <w:t xml:space="preserve">Desirable</w:t>
+              <w:t xml:space="preserve">[rating]</w:t>
             </w:r>
           </w:p>
         </w:tc>
@@ -8011,7 +8011,7 @@
                 <w:sz w:val="18"/>
                 <w:szCs w:val="18"/>
               </w:rPr>
-              <w:t xml:space="preserve">Essential</w:t>
+              <w:t xml:space="preserve">[rating]</w:t>
             </w:r>
           </w:p>
         </w:tc>
@@ -8042,7 +8042,7 @@
                 <w:sz w:val="18"/>
                 <w:szCs w:val="18"/>
               </w:rPr>
-              <w:t xml:space="preserve">Medium risk / Low benefit</w:t>
+              <w:t xml:space="preserve">[risk / benefit]</w:t>
             </w:r>
           </w:p>
         </w:tc>
@@ -8073,7 +8073,7 @@
                 <w:sz w:val="18"/>
                 <w:szCs w:val="18"/>
               </w:rPr>
-              <w:t xml:space="preserve">High / Medium</w:t>
+              <w:t xml:space="preserve">[scalability]</w:t>
             </w:r>
           </w:p>
         </w:tc>
@@ -8107,7 +8107,7 @@
                 <w:sz w:val="18"/>
                 <w:szCs w:val="18"/>
               </w:rPr>
-              <w:t xml:space="preserve">iQuarius+</w:t>
+              <w:t xml:space="preserve">Workstream D</w:t>
             </w:r>
           </w:p>
         </w:tc>
@@ -8139,7 +8139,7 @@
                 <w:sz w:val="18"/>
                 <w:szCs w:val="18"/>
               </w:rPr>
-              <w:t xml:space="preserve">Essential</w:t>
+              <w:t xml:space="preserve">[rating]</w:t>
             </w:r>
           </w:p>
         </w:tc>
@@ -8171,7 +8171,7 @@
                 <w:sz w:val="18"/>
                 <w:szCs w:val="18"/>
               </w:rPr>
-              <w:t xml:space="preserve">Essential</w:t>
+              <w:t xml:space="preserve">[rating]</w:t>
             </w:r>
           </w:p>
         </w:tc>
@@ -8203,7 +8203,7 @@
                 <w:sz w:val="18"/>
                 <w:szCs w:val="18"/>
               </w:rPr>
-              <w:t xml:space="preserve">High risk / High benefit</w:t>
+              <w:t xml:space="preserve">[risk / benefit]</w:t>
             </w:r>
           </w:p>
         </w:tc>
@@ -8235,7 +8235,7 @@
                 <w:sz w:val="18"/>
                 <w:szCs w:val="18"/>
               </w:rPr>
-              <w:t xml:space="preserve">High / High</w:t>
+              <w:t xml:space="preserve">[scalability]</w:t>
             </w:r>
           </w:p>
         </w:tc>
@@ -8257,7 +8257,7 @@
           <w:sz w:val="22"/>
           <w:szCs w:val="22"/>
         </w:rPr>
-        <w:t xml:space="preserve">Aqualogic has developed an optimisation model capable of simulating the impact on budgets and leakage levels under a range of operational scenarios. The model uses cost-relationship data for each project type, incorporates estimates of background leakage, and factors in efficiencies that vary with the scale and maturity of each workstream. The model is available to South West Water and can be expanded to include additional leakage projects beyond Aqualogic's current scope.</w:t>
+        <w:t xml:space="preserve">Lorem ipsum dolor sit amet, consectetur adipiscing elit. Sed do eiusmod tempor incididunt ut labore et dolore magna aliqua. Ut enim ad minim veniam, quis nostrud exercitation ullamco laboris nisi ut aliquip ex ea commodo consequat. Duis aute irure dolor in reprehenderit in voluptate velit esse cillum dolore eu fugiat nulla pariatur.</w:t>
       </w:r>
     </w:p>
     <w:p>
@@ -8312,7 +8312,7 @@
           <w:sz w:val="22"/>
           <w:szCs w:val="22"/>
         </w:rPr>
-        <w:t xml:space="preserve">The table below summarises the field and management resource deployed across each project.</w:t>
+        <w:t xml:space="preserve">Lorem ipsum dolor sit amet, consectetur adipiscing elit. Sed do eiusmod tempor incididunt ut labore et dolore magna aliqua.</w:t>
       </w:r>
     </w:p>
     <w:tbl>
@@ -8462,7 +8462,7 @@
                 <w:sz w:val="18"/>
                 <w:szCs w:val="18"/>
               </w:rPr>
-              <w:t xml:space="preserve">PRV Servicing</w:t>
+              <w:t xml:space="preserve">Project 1</w:t>
             </w:r>
           </w:p>
         </w:tc>
@@ -8493,7 +8493,7 @@
                 <w:sz w:val="18"/>
                 <w:szCs w:val="18"/>
               </w:rPr>
-              <w:t xml:space="preserve">4</w:t>
+              <w:t xml:space="preserve">00</w:t>
             </w:r>
           </w:p>
         </w:tc>
@@ -8524,7 +8524,7 @@
                 <w:sz w:val="18"/>
                 <w:szCs w:val="18"/>
               </w:rPr>
-              <w:t xml:space="preserve">1</w:t>
+              <w:t xml:space="preserve">00</w:t>
             </w:r>
           </w:p>
         </w:tc>
@@ -8558,7 +8558,7 @@
                 <w:sz w:val="18"/>
                 <w:szCs w:val="18"/>
               </w:rPr>
-              <w:t xml:space="preserve">Scheme Designs</w:t>
+              <w:t xml:space="preserve">Project 2</w:t>
             </w:r>
           </w:p>
         </w:tc>
@@ -8590,7 +8590,7 @@
                 <w:sz w:val="18"/>
                 <w:szCs w:val="18"/>
               </w:rPr>
-              <w:t xml:space="preserve">2</w:t>
+              <w:t xml:space="preserve">00</w:t>
             </w:r>
           </w:p>
         </w:tc>
@@ -8622,7 +8622,7 @@
                 <w:sz w:val="18"/>
                 <w:szCs w:val="18"/>
               </w:rPr>
-              <w:t xml:space="preserve">1</w:t>
+              <w:t xml:space="preserve">00</w:t>
             </w:r>
           </w:p>
         </w:tc>
@@ -8655,7 +8655,7 @@
                 <w:sz w:val="18"/>
                 <w:szCs w:val="18"/>
               </w:rPr>
-              <w:t xml:space="preserve">Controller Schemes</w:t>
+              <w:t xml:space="preserve">Project 3</w:t>
             </w:r>
           </w:p>
         </w:tc>
@@ -8686,7 +8686,7 @@
                 <w:sz w:val="18"/>
                 <w:szCs w:val="18"/>
               </w:rPr>
-              <w:t xml:space="preserve">1</w:t>
+              <w:t xml:space="preserve">00</w:t>
             </w:r>
           </w:p>
         </w:tc>
@@ -8751,7 +8751,7 @@
                 <w:sz w:val="18"/>
                 <w:szCs w:val="18"/>
               </w:rPr>
-              <w:t xml:space="preserve">Controller Optimisations</w:t>
+              <w:t xml:space="preserve">Project 4</w:t>
             </w:r>
           </w:p>
         </w:tc>
@@ -8783,7 +8783,7 @@
                 <w:sz w:val="18"/>
                 <w:szCs w:val="18"/>
               </w:rPr>
-              <w:t xml:space="preserve">1</w:t>
+              <w:t xml:space="preserve">00</w:t>
             </w:r>
           </w:p>
         </w:tc>
@@ -8848,7 +8848,7 @@
                 <w:sz w:val="18"/>
                 <w:szCs w:val="18"/>
               </w:rPr>
-              <w:t xml:space="preserve">Upstream Losses</w:t>
+              <w:t xml:space="preserve">Workstream B</w:t>
             </w:r>
           </w:p>
         </w:tc>
@@ -8879,7 +8879,7 @@
                 <w:sz w:val="18"/>
                 <w:szCs w:val="18"/>
               </w:rPr>
-              <w:t xml:space="preserve">22</w:t>
+              <w:t xml:space="preserve">00</w:t>
             </w:r>
           </w:p>
         </w:tc>
@@ -8910,7 +8910,7 @@
                 <w:sz w:val="18"/>
                 <w:szCs w:val="18"/>
               </w:rPr>
-              <w:t xml:space="preserve">3</w:t>
+              <w:t xml:space="preserve">00</w:t>
             </w:r>
           </w:p>
         </w:tc>
@@ -8944,7 +8944,7 @@
                 <w:sz w:val="18"/>
                 <w:szCs w:val="18"/>
               </w:rPr>
-              <w:t xml:space="preserve">Operable</w:t>
+              <w:t xml:space="preserve">Project 5</w:t>
             </w:r>
           </w:p>
         </w:tc>
@@ -8976,7 +8976,7 @@
                 <w:sz w:val="18"/>
                 <w:szCs w:val="18"/>
               </w:rPr>
-              <w:t xml:space="preserve">8</w:t>
+              <w:t xml:space="preserve">00</w:t>
             </w:r>
           </w:p>
         </w:tc>
@@ -9008,7 +9008,7 @@
                 <w:sz w:val="18"/>
                 <w:szCs w:val="18"/>
               </w:rPr>
-              <w:t xml:space="preserve">2</w:t>
+              <w:t xml:space="preserve">00</w:t>
             </w:r>
           </w:p>
         </w:tc>
@@ -9041,7 +9041,7 @@
                 <w:sz w:val="18"/>
                 <w:szCs w:val="18"/>
               </w:rPr>
-              <w:t xml:space="preserve">Inoperable</w:t>
+              <w:t xml:space="preserve">Project 6</w:t>
             </w:r>
           </w:p>
         </w:tc>
@@ -9072,7 +9072,7 @@
                 <w:sz w:val="18"/>
                 <w:szCs w:val="18"/>
               </w:rPr>
-              <w:t xml:space="preserve">8</w:t>
+              <w:t xml:space="preserve">00</w:t>
             </w:r>
           </w:p>
         </w:tc>
@@ -9137,7 +9137,7 @@
                 <w:sz w:val="18"/>
                 <w:szCs w:val="18"/>
               </w:rPr>
-              <w:t xml:space="preserve">iQuarius+</w:t>
+              <w:t xml:space="preserve">Workstream D</w:t>
             </w:r>
           </w:p>
         </w:tc>
@@ -9169,7 +9169,7 @@
                 <w:sz w:val="18"/>
                 <w:szCs w:val="18"/>
               </w:rPr>
-              <w:t xml:space="preserve">54</w:t>
+              <w:t xml:space="preserve">00</w:t>
             </w:r>
           </w:p>
         </w:tc>
@@ -9201,7 +9201,7 @@
                 <w:sz w:val="18"/>
                 <w:szCs w:val="18"/>
               </w:rPr>
-              <w:t xml:space="preserve">4</w:t>
+              <w:t xml:space="preserve">00</w:t>
             </w:r>
           </w:p>
         </w:tc>
@@ -9267,7 +9267,7 @@
                 <w:sz w:val="18"/>
                 <w:szCs w:val="18"/>
               </w:rPr>
-              <w:t xml:space="preserve">100</w:t>
+              <w:t xml:space="preserve">00</w:t>
             </w:r>
           </w:p>
         </w:tc>
@@ -9299,7 +9299,7 @@
                 <w:sz w:val="18"/>
                 <w:szCs w:val="18"/>
               </w:rPr>
-              <w:t xml:space="preserve">11</w:t>
+              <w:t xml:space="preserve">00</w:t>
             </w:r>
           </w:p>
         </w:tc>
@@ -9316,6 +9316,19 @@
           <w:docGrid w:linePitch="360"/>
         </w:sectPr>
       </w:pPr>
+    </w:p>
+    <w:p>
+      <w:pPr>
+        <w:spacing w:after="0" w:before="0" w:line="1" w:lineRule="exact"/>
+        <w:rPr>
+          <w:sz w:val="2"/>
+        </w:rPr>
+      </w:pPr>
+      <w:r>
+        <w:pict>
+          <v:rect id="backcover_bg" o:spid="_x0000_s2049" style="position:absolute;left:0;top:0;width:595.3pt;height:841.9pt;z-index:-251658240;mso-position-horizontal-relative:page;mso-position-vertical-relative:page" fillcolor="#0C2C3A" stroked="f"/>
+        </w:pict>
+      </w:r>
     </w:p>
     <w:tbl>
       <w:tblPr>
@@ -9335,7 +9348,7 @@
       </w:tblGrid>
       <w:tr>
         <w:trPr>
-          <w:trHeight w:val="16500" w:hRule="atLeast"/>
+          <w:trHeight w:val="16400" w:hRule="atLeast"/>
         </w:trPr>
         <w:tc>
           <w:tcPr>
@@ -9565,12 +9578,22 @@
         </w:tc>
       </w:tr>
     </w:tbl>
+    <w:p>
+      <w:pPr>
+        <w:spacing w:after="0" w:line="1" w:lineRule="exact"/>
+        <w:rPr>
+          <w:sz w:val="2"/>
+          <w:szCs w:val="2"/>
+        </w:rPr>
+      </w:pPr>
+    </w:p>
     <w:sectPr>
       <w:headerReference w:type="default" r:id="rId10"/>
       <w:footerReference w:type="default" r:id="rId11"/>
       <w:pgSz w:w="11906" w:h="16838" w:orient="portrait"/>
       <w:pgMar w:top="0" w:right="0" w:bottom="0" w:left="0" w:header="0" w:footer="0" w:gutter="0"/>
       <w:pgNumType/>
+      <w:vAlign w:val="center"/>
       <w:docGrid w:linePitch="360"/>
     </w:sectPr>
   </w:body>
@@ -9747,7 +9770,11 @@
 <w:ftr xmlns:wpc="http://schemas.microsoft.com/office/word/2010/wordprocessingCanvas" xmlns:mc="http://schemas.openxmlformats.org/markup-compatibility/2006" xmlns:o="urn:schemas-microsoft-com:office:office" xmlns:r="http://schemas.openxmlformats.org/officeDocument/2006/relationships" xmlns:m="http://schemas.openxmlformats.org/officeDocument/2006/math" xmlns:v="urn:schemas-microsoft-com:vml" xmlns:wp14="http://schemas.microsoft.com/office/word/2010/wordprocessingDrawing" xmlns:wp="http://schemas.openxmlformats.org/drawingml/2006/wordprocessingDrawing" xmlns:w10="urn:schemas-microsoft-com:office:word" xmlns:w="http://schemas.openxmlformats.org/wordprocessingml/2006/main" xmlns:w14="http://schemas.microsoft.com/office/word/2010/wordml" xmlns:w15="http://schemas.microsoft.com/office/word/2012/wordml" xmlns:wpg="http://schemas.microsoft.com/office/word/2010/wordprocessingGroup" xmlns:wpi="http://schemas.microsoft.com/office/word/2010/wordprocessingInk" xmlns:wne="http://schemas.microsoft.com/office/word/2006/wordml" xmlns:wps="http://schemas.microsoft.com/office/word/2010/wordprocessingShape">
   <w:p>
     <w:pPr>
-      <w:spacing w:after="0"/>
+      <w:spacing w:after="0" w:line="1" w:lineRule="exact"/>
+      <w:rPr>
+        <w:sz w:val="2"/>
+        <w:szCs w:val="2"/>
+      </w:rPr>
     </w:pPr>
   </w:p>
 </w:ftr>
@@ -9850,7 +9877,7 @@
         <w:sz w:val="15"/>
         <w:szCs w:val="15"/>
       </w:rPr>
-      <w:t xml:space="preserve">   South West Water   ·   Leakage Workstreams 2026/27</w:t>
+      <w:t xml:space="preserve">   [Client name]   ·   [Report title]</w:t>
     </w:r>
   </w:p>
 </w:hdr>
@@ -9860,7 +9887,11 @@
 <w:hdr xmlns:wpc="http://schemas.microsoft.com/office/word/2010/wordprocessingCanvas" xmlns:mc="http://schemas.openxmlformats.org/markup-compatibility/2006" xmlns:o="urn:schemas-microsoft-com:office:office" xmlns:r="http://schemas.openxmlformats.org/officeDocument/2006/relationships" xmlns:m="http://schemas.openxmlformats.org/officeDocument/2006/math" xmlns:v="urn:schemas-microsoft-com:vml" xmlns:wp14="http://schemas.microsoft.com/office/word/2010/wordprocessingDrawing" xmlns:wp="http://schemas.openxmlformats.org/drawingml/2006/wordprocessingDrawing" xmlns:w10="urn:schemas-microsoft-com:office:word" xmlns:w="http://schemas.openxmlformats.org/wordprocessingml/2006/main" xmlns:w14="http://schemas.microsoft.com/office/word/2010/wordml" xmlns:w15="http://schemas.microsoft.com/office/word/2012/wordml" xmlns:wpg="http://schemas.microsoft.com/office/word/2010/wordprocessingGroup" xmlns:wpi="http://schemas.microsoft.com/office/word/2010/wordprocessingInk" xmlns:wne="http://schemas.microsoft.com/office/word/2006/wordml" xmlns:wps="http://schemas.microsoft.com/office/word/2010/wordprocessingShape" xmlns:cx="http://schemas.microsoft.com/office/drawing/2014/chartex" xmlns:cx1="http://schemas.microsoft.com/office/drawing/2015/9/8/chartex" xmlns:cx2="http://schemas.microsoft.com/office/drawing/2015/10/21/chartex" xmlns:cx3="http://schemas.microsoft.com/office/drawing/2016/5/9/chartex" xmlns:cx4="http://schemas.microsoft.com/office/drawing/2016/5/10/chartex" xmlns:cx5="http://schemas.microsoft.com/office/drawing/2016/5/11/chartex" xmlns:cx6="http://schemas.microsoft.com/office/drawing/2016/5/12/chartex" xmlns:cx7="http://schemas.microsoft.com/office/drawing/2016/5/13/chartex" xmlns:cx8="http://schemas.microsoft.com/office/drawing/2016/5/14/chartex" xmlns:w16cid="http://schemas.microsoft.com/office/word/2016/wordml/cid" xmlns:w16se="http://schemas.microsoft.com/office/word/2015/wordml/symex">
   <w:p>
     <w:pPr>
-      <w:spacing w:after="0"/>
+      <w:spacing w:after="0" w:line="1" w:lineRule="exact"/>
+      <w:rPr>
+        <w:sz w:val="2"/>
+        <w:szCs w:val="2"/>
+      </w:rPr>
     </w:pPr>
   </w:p>
 </w:hdr>

</xml_diff>